<commit_message>
docs: document seller listings and the listing check
</commit_message>
<xml_diff>
--- a/docs/PRD.docx
+++ b/docs/PRD.docx
@@ -4442,7 +4442,7 @@
                 <w:color w:val="2B2325"/>
                 <w:sz w:val="18"/>
               </w:rPr>
-              <w:t>Listing create, edit and delete with image upload to Supabase Storage</w:t>
+              <w:t>Listing create, edit, publish, mark as sold and delete, with photo upload to Supabase Storage</w:t>
             </w:r>
           </w:p>
         </w:tc>
@@ -4473,7 +4473,203 @@
                 <w:color w:val="2B2325"/>
                 <w:sz w:val="18"/>
               </w:rPr>
-              <w:t>Planned</w:t>
+              <w:t>Built</w:t>
+            </w:r>
+          </w:p>
+        </w:tc>
+      </w:tr>
+      <w:tr>
+        <w:trPr>
+          <w:cantSplit w:val="true"/>
+        </w:trPr>
+        <w:tc>
+          <w:tcPr>
+            <w:tcW w:type="dxa" w:w="3264"/>
+            <w:shd w:val="clear" w:color="auto" w:fill="F8F6F4"/>
+            <w:tcBorders>
+              <w:top w:val="single" w:sz="4" w:space="0" w:color="E4E1DC"/>
+              <w:left w:val="single" w:sz="4" w:space="0" w:color="E4E1DC"/>
+              <w:bottom w:val="single" w:sz="4" w:space="0" w:color="E4E1DC"/>
+              <w:right w:val="single" w:sz="4" w:space="0" w:color="E4E1DC"/>
+            </w:tcBorders>
+            <w:tcMar>
+              <w:top w:w="70" w:type="dxa"/>
+              <w:bottom w:w="70" w:type="dxa"/>
+              <w:left w:w="90" w:type="dxa"/>
+              <w:right w:w="90" w:type="dxa"/>
+            </w:tcMar>
+            <w:vAlign w:val="center"/>
+          </w:tcPr>
+          <w:p>
+            <w:r>
+              <w:rPr>
+                <w:rFonts w:ascii="Calibri" w:hAnsi="Calibri" w:cs="Calibri" w:eastAsia="Calibri"/>
+                <w:b w:val="0"/>
+                <w:i w:val="0"/>
+                <w:color w:val="2B2325"/>
+                <w:sz w:val="18"/>
+              </w:rPr>
+              <w:t>Admin</w:t>
+            </w:r>
+          </w:p>
+        </w:tc>
+        <w:tc>
+          <w:tcPr>
+            <w:tcW w:type="dxa" w:w="3264"/>
+            <w:shd w:val="clear" w:color="auto" w:fill="F8F6F4"/>
+            <w:tcBorders>
+              <w:top w:val="single" w:sz="4" w:space="0" w:color="E4E1DC"/>
+              <w:left w:val="single" w:sz="4" w:space="0" w:color="E4E1DC"/>
+              <w:bottom w:val="single" w:sz="4" w:space="0" w:color="E4E1DC"/>
+              <w:right w:val="single" w:sz="4" w:space="0" w:color="E4E1DC"/>
+            </w:tcBorders>
+            <w:tcMar>
+              <w:top w:w="70" w:type="dxa"/>
+              <w:bottom w:w="70" w:type="dxa"/>
+              <w:left w:w="90" w:type="dxa"/>
+              <w:right w:w="90" w:type="dxa"/>
+            </w:tcMar>
+            <w:vAlign w:val="center"/>
+          </w:tcPr>
+          <w:p>
+            <w:r>
+              <w:rPr>
+                <w:rFonts w:ascii="Calibri" w:hAnsi="Calibri" w:cs="Calibri" w:eastAsia="Calibri"/>
+                <w:b w:val="0"/>
+                <w:i w:val="0"/>
+                <w:color w:val="2B2325"/>
+                <w:sz w:val="18"/>
+              </w:rPr>
+              <w:t>Listings section: check new listings after they go live, or remove them with a reason</w:t>
+            </w:r>
+          </w:p>
+        </w:tc>
+        <w:tc>
+          <w:tcPr>
+            <w:tcW w:type="dxa" w:w="3264"/>
+            <w:shd w:val="clear" w:color="auto" w:fill="F8F6F4"/>
+            <w:tcBorders>
+              <w:top w:val="single" w:sz="4" w:space="0" w:color="E4E1DC"/>
+              <w:left w:val="single" w:sz="4" w:space="0" w:color="E4E1DC"/>
+              <w:bottom w:val="single" w:sz="4" w:space="0" w:color="E4E1DC"/>
+              <w:right w:val="single" w:sz="4" w:space="0" w:color="E4E1DC"/>
+            </w:tcBorders>
+            <w:tcMar>
+              <w:top w:w="70" w:type="dxa"/>
+              <w:bottom w:w="70" w:type="dxa"/>
+              <w:left w:w="90" w:type="dxa"/>
+              <w:right w:w="90" w:type="dxa"/>
+            </w:tcMar>
+            <w:vAlign w:val="center"/>
+          </w:tcPr>
+          <w:p>
+            <w:r>
+              <w:rPr>
+                <w:rFonts w:ascii="Calibri" w:hAnsi="Calibri" w:cs="Calibri" w:eastAsia="Calibri"/>
+                <w:b w:val="0"/>
+                <w:i w:val="0"/>
+                <w:color w:val="2B2325"/>
+                <w:sz w:val="18"/>
+              </w:rPr>
+              <w:t>Built</w:t>
+            </w:r>
+          </w:p>
+        </w:tc>
+      </w:tr>
+      <w:tr>
+        <w:trPr>
+          <w:cantSplit w:val="true"/>
+        </w:trPr>
+        <w:tc>
+          <w:tcPr>
+            <w:tcW w:type="dxa" w:w="3264"/>
+            <w:shd w:val="clear" w:color="auto" w:fill="FFFFFF"/>
+            <w:tcBorders>
+              <w:top w:val="single" w:sz="4" w:space="0" w:color="E4E1DC"/>
+              <w:left w:val="single" w:sz="4" w:space="0" w:color="E4E1DC"/>
+              <w:bottom w:val="single" w:sz="4" w:space="0" w:color="E4E1DC"/>
+              <w:right w:val="single" w:sz="4" w:space="0" w:color="E4E1DC"/>
+            </w:tcBorders>
+            <w:tcMar>
+              <w:top w:w="70" w:type="dxa"/>
+              <w:bottom w:w="70" w:type="dxa"/>
+              <w:left w:w="90" w:type="dxa"/>
+              <w:right w:w="90" w:type="dxa"/>
+            </w:tcMar>
+            <w:vAlign w:val="center"/>
+          </w:tcPr>
+          <w:p>
+            <w:r>
+              <w:rPr>
+                <w:rFonts w:ascii="Calibri" w:hAnsi="Calibri" w:cs="Calibri" w:eastAsia="Calibri"/>
+                <w:b w:val="0"/>
+                <w:i w:val="0"/>
+                <w:color w:val="2B2325"/>
+                <w:sz w:val="18"/>
+              </w:rPr>
+              <w:t>Catalog</w:t>
+            </w:r>
+          </w:p>
+        </w:tc>
+        <w:tc>
+          <w:tcPr>
+            <w:tcW w:type="dxa" w:w="3264"/>
+            <w:shd w:val="clear" w:color="auto" w:fill="FFFFFF"/>
+            <w:tcBorders>
+              <w:top w:val="single" w:sz="4" w:space="0" w:color="E4E1DC"/>
+              <w:left w:val="single" w:sz="4" w:space="0" w:color="E4E1DC"/>
+              <w:bottom w:val="single" w:sz="4" w:space="0" w:color="E4E1DC"/>
+              <w:right w:val="single" w:sz="4" w:space="0" w:color="E4E1DC"/>
+            </w:tcBorders>
+            <w:tcMar>
+              <w:top w:w="70" w:type="dxa"/>
+              <w:bottom w:w="70" w:type="dxa"/>
+              <w:left w:w="90" w:type="dxa"/>
+              <w:right w:w="90" w:type="dxa"/>
+            </w:tcMar>
+            <w:vAlign w:val="center"/>
+          </w:tcPr>
+          <w:p>
+            <w:r>
+              <w:rPr>
+                <w:rFonts w:ascii="Calibri" w:hAnsi="Calibri" w:cs="Calibri" w:eastAsia="Calibri"/>
+                <w:b w:val="0"/>
+                <w:i w:val="0"/>
+                <w:color w:val="2B2325"/>
+                <w:sz w:val="18"/>
+              </w:rPr>
+              <w:t>"Checked" and "Not yet checked" tags on cards and a clear banner on the product page</w:t>
+            </w:r>
+          </w:p>
+        </w:tc>
+        <w:tc>
+          <w:tcPr>
+            <w:tcW w:type="dxa" w:w="3264"/>
+            <w:shd w:val="clear" w:color="auto" w:fill="FFFFFF"/>
+            <w:tcBorders>
+              <w:top w:val="single" w:sz="4" w:space="0" w:color="E4E1DC"/>
+              <w:left w:val="single" w:sz="4" w:space="0" w:color="E4E1DC"/>
+              <w:bottom w:val="single" w:sz="4" w:space="0" w:color="E4E1DC"/>
+              <w:right w:val="single" w:sz="4" w:space="0" w:color="E4E1DC"/>
+            </w:tcBorders>
+            <w:tcMar>
+              <w:top w:w="70" w:type="dxa"/>
+              <w:bottom w:w="70" w:type="dxa"/>
+              <w:left w:w="90" w:type="dxa"/>
+              <w:right w:w="90" w:type="dxa"/>
+            </w:tcMar>
+            <w:vAlign w:val="center"/>
+          </w:tcPr>
+          <w:p>
+            <w:r>
+              <w:rPr>
+                <w:rFonts w:ascii="Calibri" w:hAnsi="Calibri" w:cs="Calibri" w:eastAsia="Calibri"/>
+                <w:b w:val="0"/>
+                <w:i w:val="0"/>
+                <w:color w:val="2B2325"/>
+                <w:sz w:val="18"/>
+              </w:rPr>
+              <w:t>Built</w:t>
             </w:r>
           </w:p>
         </w:tc>

</xml_diff>

<commit_message>
docs: document cart, checkout and orders
</commit_message>
<xml_diff>
--- a/docs/PRD.docx
+++ b/docs/PRD.docx
@@ -4736,7 +4736,7 @@
                 <w:color w:val="2B2325"/>
                 <w:sz w:val="18"/>
               </w:rPr>
-              <w:t>Cart, shipping address, cash on delivery order creation (one order per seller)</w:t>
+              <w:t>Cart, delivery address, cash on delivery orders (one order per seller), buyer order list and cancel</w:t>
             </w:r>
           </w:p>
         </w:tc>
@@ -4767,7 +4767,7 @@
                 <w:color w:val="2B2325"/>
                 <w:sz w:val="18"/>
               </w:rPr>
-              <w:t>Planned</w:t>
+              <w:t>Built</w:t>
             </w:r>
           </w:p>
         </w:tc>
@@ -4834,7 +4834,7 @@
                 <w:color w:val="2B2325"/>
                 <w:sz w:val="18"/>
               </w:rPr>
-              <w:t>Status tracking and seller fulfilment, COD collection confirmation</w:t>
+              <w:t>Seller fulfilment (confirm, ship, deliver) and COD collection confirmation</w:t>
             </w:r>
           </w:p>
         </w:tc>

</xml_diff>

<commit_message>
docs: document seller order handling
</commit_message>
<xml_diff>
--- a/docs/PRD.docx
+++ b/docs/PRD.docx
@@ -4834,7 +4834,7 @@
                 <w:color w:val="2B2325"/>
                 <w:sz w:val="18"/>
               </w:rPr>
-              <w:t>Seller fulfilment (confirm, ship, deliver) and COD collection confirmation</w:t>
+              <w:t>Seller fulfilment (confirm, ship, deliver, cancel with a reason) and cash collection on delivery</w:t>
             </w:r>
           </w:p>
         </w:tc>
@@ -4865,7 +4865,7 @@
                 <w:color w:val="2B2325"/>
                 <w:sz w:val="18"/>
               </w:rPr>
-              <w:t>Planned</w:t>
+              <w:t>Built</w:t>
             </w:r>
           </w:p>
         </w:tc>

</xml_diff>

<commit_message>
docs: refresh the PRD document
</commit_message>
<xml_diff>
--- a/docs/PRD.docx
+++ b/docs/PRD.docx
@@ -2922,17 +2922,7 @@
           <w:color w:val="2B2325"/>
           <w:sz w:val="21"/>
         </w:rPr>
-        <w:t xml:space="preserve">Leave a rating and review after delivery. </w:t>
-      </w:r>
-      <w:r>
-        <w:rPr>
-          <w:rFonts w:ascii="Calibri" w:hAnsi="Calibri" w:cs="Calibri" w:eastAsia="Calibri"/>
-          <w:b w:val="0"/>
-          <w:i/>
-          <w:color w:val="6E6862"/>
-          <w:sz w:val="21"/>
-        </w:rPr>
-        <w:t>(planned)</w:t>
+        <w:t>Leave a rating and review after delivery (built).</w:t>
       </w:r>
     </w:p>
     <w:p>
@@ -4963,7 +4953,7 @@
                 <w:color w:val="2B2325"/>
                 <w:sz w:val="18"/>
               </w:rPr>
-              <w:t>Planned</w:t>
+              <w:t>Built</w:t>
             </w:r>
           </w:p>
         </w:tc>

</xml_diff>

<commit_message>
fix(web): allow only buyer accounts to use the cart and place orders
</commit_message>
<xml_diff>
--- a/docs/PRD.docx
+++ b/docs/PRD.docx
@@ -922,7 +922,7 @@
                 <w:color w:val="2B2325"/>
                 <w:sz w:val="18"/>
               </w:rPr>
-              <w:t>A Buyer whose application was approved. Lists products, fulfils orders, sees earnings.</w:t>
+              <w:t>A Buyer whose application was approved. Lists and fulfils orders; cannot buy.</w:t>
             </w:r>
           </w:p>
         </w:tc>
@@ -1476,7 +1476,7 @@
                 <w:color w:val="2B2325"/>
                 <w:sz w:val="18"/>
               </w:rPr>
-              <w:t>Yes</w:t>
+              <w:t>-</w:t>
             </w:r>
           </w:p>
         </w:tc>
@@ -1605,7 +1605,7 @@
                 <w:color w:val="2B2325"/>
                 <w:sz w:val="18"/>
               </w:rPr>
-              <w:t>Yes</w:t>
+              <w:t>-</w:t>
             </w:r>
           </w:p>
         </w:tc>

</xml_diff>